<commit_message>
Sergio Bermudez: reserva clientes
</commit_message>
<xml_diff>
--- a/Fase 4 Practicas Simuladas.docx
+++ b/Fase 4 Practicas Simuladas.docx
@@ -1,6 +1,6 @@
 
 <file path=word/document.xml><?xml version="1.0" encoding="utf-8"?>
-<w:document xmlns:wpc="http://schemas.microsoft.com/office/word/2010/wordprocessingCanvas" xmlns:cx="http://schemas.microsoft.com/office/drawing/2014/chartex" xmlns:cx1="http://schemas.microsoft.com/office/drawing/2015/9/8/chartex" xmlns:cx2="http://schemas.microsoft.com/office/drawing/2015/10/21/chartex" xmlns:cx3="http://schemas.microsoft.com/office/drawing/2016/5/9/chartex" xmlns:cx4="http://schemas.microsoft.com/office/drawing/2016/5/10/chartex" xmlns:cx5="http://schemas.microsoft.com/office/drawing/2016/5/11/chartex" xmlns:cx6="http://schemas.microsoft.com/office/drawing/2016/5/12/chartex" xmlns:cx7="http://schemas.microsoft.com/office/drawing/2016/5/13/chartex" xmlns:cx8="http://schemas.microsoft.com/office/drawing/2016/5/14/chartex" xmlns:mc="http://schemas.openxmlformats.org/markup-compatibility/2006" xmlns:aink="http://schemas.microsoft.com/office/drawing/2016/ink" xmlns:am3d="http://schemas.microsoft.com/office/drawing/2017/model3d" xmlns:o="urn:schemas-microsoft-com:office:office" xmlns:oel="http://schemas.microsoft.com/office/2019/extlst" xmlns:r="http://schemas.openxmlformats.org/officeDocument/2006/relationships" xmlns:m="http://schemas.openxmlformats.org/officeDocument/2006/math" xmlns:v="urn:schemas-microsoft-com:vml" xmlns:wp14="http://schemas.microsoft.com/office/word/2010/wordprocessingDrawing" xmlns:wp="http://schemas.openxmlformats.org/drawingml/2006/wordprocessingDrawing" xmlns:w10="urn:schemas-microsoft-com:office:word" xmlns:w="http://schemas.openxmlformats.org/wordprocessingml/2006/main" xmlns:w14="http://schemas.microsoft.com/office/word/2010/wordml" xmlns:w15="http://schemas.microsoft.com/office/word/2012/wordml" xmlns:w16cex="http://schemas.microsoft.com/office/word/2018/wordml/cex" xmlns:w16cid="http://schemas.microsoft.com/office/word/2016/wordml/cid" xmlns:w16="http://schemas.microsoft.com/office/word/2018/wordml" xmlns:w16du="http://schemas.microsoft.com/office/word/2023/wordml/word16du" xmlns:w16sdtdh="http://schemas.microsoft.com/office/word/2020/wordml/sdtdatahash" xmlns:w16sdtfl="http://schemas.microsoft.com/office/word/2024/wordml/sdtformatlock" xmlns:w16se="http://schemas.microsoft.com/office/word/2015/wordml/symex" xmlns:wpg="http://schemas.microsoft.com/office/word/2010/wordprocessingGroup" xmlns:wpi="http://schemas.microsoft.com/office/word/2010/wordprocessingInk" xmlns:wne="http://schemas.microsoft.com/office/word/2006/wordml" xmlns:wps="http://schemas.microsoft.com/office/word/2010/wordprocessingShape" mc:Ignorable="w14 w15 w16se w16cid w16 w16cex w16sdtdh w16sdtfl w16du wp14">
+<w:document xmlns:wpc="http://schemas.microsoft.com/office/word/2010/wordprocessingCanvas" xmlns:cx="http://schemas.microsoft.com/office/drawing/2014/chartex" xmlns:mc="http://schemas.openxmlformats.org/markup-compatibility/2006" xmlns:o="urn:schemas-microsoft-com:office:office" xmlns:r="http://schemas.openxmlformats.org/officeDocument/2006/relationships" xmlns:m="http://schemas.openxmlformats.org/officeDocument/2006/math" xmlns:v="urn:schemas-microsoft-com:vml" xmlns:wp14="http://schemas.microsoft.com/office/word/2010/wordprocessingDrawing" xmlns:wp="http://schemas.openxmlformats.org/drawingml/2006/wordprocessingDrawing" xmlns:w10="urn:schemas-microsoft-com:office:word" xmlns:w="http://schemas.openxmlformats.org/wordprocessingml/2006/main" xmlns:w14="http://schemas.microsoft.com/office/word/2010/wordml" xmlns:w15="http://schemas.microsoft.com/office/word/2012/wordml" xmlns:w16se="http://schemas.microsoft.com/office/word/2015/wordml/symex" xmlns:wpg="http://schemas.microsoft.com/office/word/2010/wordprocessingGroup" xmlns:wpi="http://schemas.microsoft.com/office/word/2010/wordprocessingInk" xmlns:wne="http://schemas.microsoft.com/office/word/2006/wordml" xmlns:wps="http://schemas.microsoft.com/office/word/2010/wordprocessingShape" mc:Ignorable="w14 w15 w16se wp14">
   <w:body>
     <w:p>
       <w:pPr>
@@ -33,18 +33,21 @@
           <w:sz w:val="28"/>
           <w:szCs w:val="28"/>
         </w:rPr>
-        <w:t xml:space="preserve">Fase 4 </w:t>
-      </w:r>
-      <w:r>
-        <w:rPr>
-          <w:rFonts w:ascii="Times New Roman" w:hAnsi="Times New Roman" w:cs="Times New Roman"/>
-          <w:b/>
-          <w:bCs/>
-          <w:sz w:val="28"/>
-          <w:szCs w:val="28"/>
-        </w:rPr>
-        <w:t>Componente práctico - Prácticas simuladas</w:t>
-      </w:r>
+        <w:t>Fase 4 Componente práctico - Prácticas simuladas</w:t>
+      </w:r>
+    </w:p>
+    <w:p>
+      <w:pPr>
+        <w:rPr>
+          <w:rFonts w:ascii="Times New Roman" w:hAnsi="Times New Roman" w:cs="Times New Roman"/>
+          <w:b/>
+          <w:bCs/>
+          <w:sz w:val="28"/>
+          <w:szCs w:val="28"/>
+        </w:rPr>
+      </w:pPr>
+      <w:bookmarkStart w:id="0" w:name="_GoBack"/>
+      <w:bookmarkEnd w:id="0"/>
     </w:p>
     <w:p>
       <w:pPr>
@@ -57,6 +60,16 @@
           <w:szCs w:val="28"/>
         </w:rPr>
       </w:pPr>
+      <w:r>
+        <w:rPr>
+          <w:rFonts w:ascii="Times New Roman" w:hAnsi="Times New Roman" w:cs="Times New Roman"/>
+          <w:b/>
+          <w:bCs/>
+          <w:sz w:val="28"/>
+          <w:szCs w:val="28"/>
+        </w:rPr>
+        <w:t>Estudiantes:</w:t>
+      </w:r>
     </w:p>
     <w:p>
       <w:pPr>
@@ -69,6 +82,16 @@
           <w:szCs w:val="28"/>
         </w:rPr>
       </w:pPr>
+      <w:r>
+        <w:rPr>
+          <w:rFonts w:ascii="Times New Roman" w:hAnsi="Times New Roman" w:cs="Times New Roman"/>
+          <w:b/>
+          <w:bCs/>
+          <w:sz w:val="28"/>
+          <w:szCs w:val="28"/>
+        </w:rPr>
+        <w:t>Camilo Andres Moreno Acevedo</w:t>
+      </w:r>
     </w:p>
     <w:p>
       <w:pPr>
@@ -89,7 +112,7 @@
           <w:sz w:val="28"/>
           <w:szCs w:val="28"/>
         </w:rPr>
-        <w:t>Estudiantes:</w:t>
+        <w:t>YOJAN ESTIVEN GARAY PINILLA</w:t>
       </w:r>
     </w:p>
     <w:p>
@@ -111,7 +134,7 @@
           <w:sz w:val="28"/>
           <w:szCs w:val="28"/>
         </w:rPr>
-        <w:t>Camilo Andres Moreno Acevedo</w:t>
+        <w:t>FREDI GUZMAN PEÑA</w:t>
       </w:r>
     </w:p>
     <w:p>
@@ -133,7 +156,7 @@
           <w:sz w:val="28"/>
           <w:szCs w:val="28"/>
         </w:rPr>
-        <w:t>YOJAN ESTIVEN GARAY PINILLA</w:t>
+        <w:t>SERGIO ESTEBAN BERMUDEZ CORDERO</w:t>
       </w:r>
     </w:p>
     <w:p>
@@ -147,16 +170,6 @@
           <w:szCs w:val="28"/>
         </w:rPr>
       </w:pPr>
-      <w:r>
-        <w:rPr>
-          <w:rFonts w:ascii="Times New Roman" w:hAnsi="Times New Roman" w:cs="Times New Roman"/>
-          <w:b/>
-          <w:bCs/>
-          <w:sz w:val="28"/>
-          <w:szCs w:val="28"/>
-        </w:rPr>
-        <w:t>FREDI GUZMAN PEÑA</w:t>
-      </w:r>
     </w:p>
     <w:p>
       <w:pPr>
@@ -176,11 +189,31 @@
         <w:rPr>
           <w:rFonts w:ascii="Times New Roman" w:hAnsi="Times New Roman" w:cs="Times New Roman"/>
           <w:b/>
-          <w:bCs/>
-          <w:sz w:val="28"/>
-          <w:szCs w:val="28"/>
-        </w:rPr>
-      </w:pPr>
+          <w:spacing w:val="-2"/>
+          <w:sz w:val="28"/>
+          <w:szCs w:val="28"/>
+        </w:rPr>
+      </w:pPr>
+      <w:r>
+        <w:rPr>
+          <w:rFonts w:ascii="Times New Roman" w:hAnsi="Times New Roman" w:cs="Times New Roman"/>
+          <w:b/>
+          <w:spacing w:val="-2"/>
+          <w:sz w:val="28"/>
+          <w:szCs w:val="28"/>
+        </w:rPr>
+        <w:t xml:space="preserve">Grupo: </w:t>
+      </w:r>
+      <w:r>
+        <w:rPr>
+          <w:rFonts w:ascii="Times New Roman" w:hAnsi="Times New Roman" w:cs="Times New Roman"/>
+          <w:b/>
+          <w:spacing w:val="-2"/>
+          <w:sz w:val="28"/>
+          <w:szCs w:val="28"/>
+        </w:rPr>
+        <w:t>213023_409</w:t>
+      </w:r>
     </w:p>
     <w:p>
       <w:pPr>
@@ -193,7 +226,10 @@
           <w:szCs w:val="28"/>
         </w:rPr>
       </w:pPr>
-      <w:r>
+    </w:p>
+    <w:p>
+      <w:pPr>
+        <w:jc w:val="center"/>
         <w:rPr>
           <w:rFonts w:ascii="Times New Roman" w:hAnsi="Times New Roman" w:cs="Times New Roman"/>
           <w:b/>
@@ -201,46 +237,11 @@
           <w:sz w:val="28"/>
           <w:szCs w:val="28"/>
         </w:rPr>
-        <w:t xml:space="preserve">Grupo: </w:t>
-      </w:r>
-      <w:r>
-        <w:rPr>
-          <w:rFonts w:ascii="Times New Roman" w:hAnsi="Times New Roman" w:cs="Times New Roman"/>
-          <w:b/>
-          <w:spacing w:val="-2"/>
-          <w:sz w:val="28"/>
-          <w:szCs w:val="28"/>
-        </w:rPr>
-        <w:t>213023_409</w:t>
-      </w:r>
-    </w:p>
-    <w:p>
-      <w:pPr>
-        <w:jc w:val="center"/>
-        <w:rPr>
-          <w:rFonts w:ascii="Times New Roman" w:hAnsi="Times New Roman" w:cs="Times New Roman"/>
-          <w:b/>
-          <w:spacing w:val="-2"/>
-          <w:sz w:val="28"/>
-          <w:szCs w:val="28"/>
-        </w:rPr>
-      </w:pPr>
-    </w:p>
-    <w:p>
-      <w:pPr>
-        <w:jc w:val="center"/>
-        <w:rPr>
-          <w:rFonts w:ascii="Times New Roman" w:hAnsi="Times New Roman" w:cs="Times New Roman"/>
-          <w:b/>
-          <w:spacing w:val="-2"/>
-          <w:sz w:val="28"/>
-          <w:szCs w:val="28"/>
-        </w:rPr>
-      </w:pPr>
-    </w:p>
-    <w:p>
-      <w:pPr>
-        <w:pStyle w:val="BodyText"/>
+      </w:pPr>
+    </w:p>
+    <w:p>
+      <w:pPr>
+        <w:pStyle w:val="Textoindependiente"/>
         <w:spacing w:before="138"/>
         <w:jc w:val="center"/>
         <w:rPr>
@@ -553,19 +554,7 @@
         <w:rPr>
           <w:rFonts w:ascii="Times New Roman" w:hAnsi="Times New Roman" w:cs="Times New Roman"/>
         </w:rPr>
-        <w:t xml:space="preserve">Este trabajo describe el avance </w:t>
-      </w:r>
-      <w:r>
-        <w:rPr>
-          <w:rFonts w:ascii="Times New Roman" w:hAnsi="Times New Roman" w:cs="Times New Roman"/>
-        </w:rPr>
-        <w:t>de la fase 4</w:t>
-      </w:r>
-      <w:r>
-        <w:rPr>
-          <w:rFonts w:ascii="Times New Roman" w:hAnsi="Times New Roman" w:cs="Times New Roman"/>
-        </w:rPr>
-        <w:t xml:space="preserve"> en la asignatura de Programación. A partir de cero, surge un sistema operativo para una compañía imaginaria llamada "Software FJ". Dicho entorno gestiona inscripciones de usuarios, organiza ofertas técnicas - como espacios, dispositivos o consultorías - además de gestionar pedidos programados. No obstante, todo funciona únicamente mediante almacenamiento volátil. Ni rastros de sistemas externos ni herramientas persistentes aparecen durante su ejecución.</w:t>
+        <w:t>Este trabajo describe el avance de la fase 4 en la asignatura de Programación. A partir de cero, surge un sistema operativo para una compañía imaginaria llamada "Software FJ". Dicho entorno gestiona inscripciones de usuarios, organiza ofertas técnicas - como espacios, dispositivos o consultorías - además de gestionar pedidos programados. No obstante, todo funciona únicamente mediante almacenamiento volátil. Ni rastros de sistemas externos ni herramientas persistentes aparecen durante su ejecución.</w:t>
       </w:r>
     </w:p>
     <w:p>
@@ -598,11 +587,6 @@
           <w:rFonts w:ascii="Times New Roman" w:hAnsi="Times New Roman" w:cs="Times New Roman"/>
         </w:rPr>
         <w:br/>
-      </w:r>
-      <w:r>
-        <w:rPr>
-          <w:rFonts w:ascii="Times New Roman" w:hAnsi="Times New Roman" w:cs="Times New Roman"/>
-        </w:rPr>
         <w:t xml:space="preserve">Al crear errores personalizados, conectarlos entre sí y usar bloques claros como try, </w:t>
       </w:r>
       <w:proofErr w:type="spellStart"/>
@@ -658,11 +642,6 @@
           <w:rFonts w:ascii="Times New Roman" w:hAnsi="Times New Roman" w:cs="Times New Roman"/>
         </w:rPr>
         <w:br/>
-      </w:r>
-      <w:r>
-        <w:rPr>
-          <w:rFonts w:ascii="Times New Roman" w:hAnsi="Times New Roman" w:cs="Times New Roman"/>
-        </w:rPr>
         <w:t>Al final, el código y el historial de cambios de este proyecto se han guardado y organizado en un repositorio de GitHub. El enlace al repositorio viene incluido en este informe para que se pueda revisar y comprobar.</w:t>
       </w:r>
     </w:p>
@@ -714,21 +693,9 @@
       <w:hyperlink r:id="rId8" w:history="1">
         <w:r>
           <w:rPr>
-            <w:rStyle w:val="Hyperlink"/>
+            <w:rStyle w:val="Hipervnculo"/>
           </w:rPr>
-          <w:t>https://github.com/Camil0Dev/Fase4_Programacion_Softwar</w:t>
-        </w:r>
-        <w:r>
-          <w:rPr>
-            <w:rStyle w:val="Hyperlink"/>
-          </w:rPr>
-          <w:t>e</w:t>
-        </w:r>
-        <w:r>
-          <w:rPr>
-            <w:rStyle w:val="Hyperlink"/>
-          </w:rPr>
-          <w:t>FJ</w:t>
+          <w:t>https://github.com/Camil0Dev/Fase4_Programacion_SoftwareFJ</w:t>
         </w:r>
       </w:hyperlink>
     </w:p>
@@ -883,7 +850,7 @@
       <w:pPr>
         <w:rPr>
           <w:rFonts w:ascii="Times New Roman" w:hAnsi="Times New Roman" w:cs="Times New Roman"/>
-          <w:lang w:val="en-US"/>
+          <w:lang w:val="es-MX"/>
         </w:rPr>
       </w:pPr>
       <w:r>
@@ -941,44 +908,19 @@
         </w:rPr>
         <w:t xml:space="preserve"> OVI]. </w:t>
       </w:r>
-      <w:proofErr w:type="spellStart"/>
-      <w:r>
-        <w:rPr>
-          <w:rFonts w:ascii="Times New Roman" w:hAnsi="Times New Roman" w:cs="Times New Roman"/>
-          <w:lang w:val="en-US"/>
-        </w:rPr>
-        <w:t>Repositorio</w:t>
-      </w:r>
-      <w:proofErr w:type="spellEnd"/>
-      <w:r>
-        <w:rPr>
-          <w:rFonts w:ascii="Times New Roman" w:hAnsi="Times New Roman" w:cs="Times New Roman"/>
-          <w:lang w:val="en-US"/>
-        </w:rPr>
-        <w:t xml:space="preserve"> </w:t>
-      </w:r>
-      <w:proofErr w:type="spellStart"/>
-      <w:r>
-        <w:rPr>
-          <w:rFonts w:ascii="Times New Roman" w:hAnsi="Times New Roman" w:cs="Times New Roman"/>
-          <w:lang w:val="en-US"/>
-        </w:rPr>
-        <w:t>Institucional</w:t>
-      </w:r>
-      <w:proofErr w:type="spellEnd"/>
-      <w:r>
-        <w:rPr>
-          <w:rFonts w:ascii="Times New Roman" w:hAnsi="Times New Roman" w:cs="Times New Roman"/>
-          <w:lang w:val="en-US"/>
-        </w:rPr>
-        <w:t xml:space="preserve"> UNAD. </w:t>
+      <w:r>
+        <w:rPr>
+          <w:rFonts w:ascii="Times New Roman" w:hAnsi="Times New Roman" w:cs="Times New Roman"/>
+          <w:lang w:val="es-MX"/>
+        </w:rPr>
+        <w:t xml:space="preserve">Repositorio Institucional UNAD. </w:t>
       </w:r>
       <w:hyperlink r:id="rId9" w:tgtFrame="_blank" w:history="1">
         <w:r>
           <w:rPr>
-            <w:rStyle w:val="Hyperlink"/>
+            <w:rStyle w:val="Hipervnculo"/>
             <w:rFonts w:ascii="Times New Roman" w:hAnsi="Times New Roman" w:cs="Times New Roman"/>
-            <w:lang w:val="en-US"/>
+            <w:lang w:val="es-MX"/>
           </w:rPr>
           <w:t>https://repository.unad.edu.co/handle/10596/75882</w:t>
         </w:r>
@@ -988,15 +930,47 @@
       <w:pPr>
         <w:rPr>
           <w:rFonts w:ascii="Times New Roman" w:hAnsi="Times New Roman" w:cs="Times New Roman"/>
-          <w:lang w:val="en-US"/>
-        </w:rPr>
-      </w:pPr>
-      <w:r>
-        <w:rPr>
-          <w:rFonts w:ascii="Times New Roman" w:hAnsi="Times New Roman" w:cs="Times New Roman"/>
-          <w:lang w:val="en-US"/>
-        </w:rPr>
-        <w:t xml:space="preserve">Van Rossum, G., &amp; Drake Jr, F. L. (2024). </w:t>
+          <w:lang w:val="es-MX"/>
+        </w:rPr>
+      </w:pPr>
+      <w:r>
+        <w:rPr>
+          <w:rFonts w:ascii="Times New Roman" w:hAnsi="Times New Roman" w:cs="Times New Roman"/>
+          <w:lang w:val="es-MX"/>
+        </w:rPr>
+        <w:t xml:space="preserve">Van </w:t>
+      </w:r>
+      <w:proofErr w:type="spellStart"/>
+      <w:r>
+        <w:rPr>
+          <w:rFonts w:ascii="Times New Roman" w:hAnsi="Times New Roman" w:cs="Times New Roman"/>
+          <w:lang w:val="es-MX"/>
+        </w:rPr>
+        <w:t>Rossum</w:t>
+      </w:r>
+      <w:proofErr w:type="spellEnd"/>
+      <w:r>
+        <w:rPr>
+          <w:rFonts w:ascii="Times New Roman" w:hAnsi="Times New Roman" w:cs="Times New Roman"/>
+          <w:lang w:val="es-MX"/>
+        </w:rPr>
+        <w:t xml:space="preserve">, G., &amp; Drake </w:t>
+      </w:r>
+      <w:proofErr w:type="spellStart"/>
+      <w:r>
+        <w:rPr>
+          <w:rFonts w:ascii="Times New Roman" w:hAnsi="Times New Roman" w:cs="Times New Roman"/>
+          <w:lang w:val="es-MX"/>
+        </w:rPr>
+        <w:t>Jr</w:t>
+      </w:r>
+      <w:proofErr w:type="spellEnd"/>
+      <w:r>
+        <w:rPr>
+          <w:rFonts w:ascii="Times New Roman" w:hAnsi="Times New Roman" w:cs="Times New Roman"/>
+          <w:lang w:val="es-MX"/>
+        </w:rPr>
+        <w:t xml:space="preserve">, F. L. (2024). </w:t>
       </w:r>
       <w:r>
         <w:rPr>
@@ -1015,16 +989,32 @@
       <w:r>
         <w:rPr>
           <w:rFonts w:ascii="Times New Roman" w:hAnsi="Times New Roman" w:cs="Times New Roman"/>
-          <w:lang w:val="en-US"/>
-        </w:rPr>
-        <w:t xml:space="preserve">Python Software Foundation. </w:t>
+          <w:lang w:val="es-MX"/>
+        </w:rPr>
+        <w:t xml:space="preserve">Python Software </w:t>
+      </w:r>
+      <w:proofErr w:type="spellStart"/>
+      <w:r>
+        <w:rPr>
+          <w:rFonts w:ascii="Times New Roman" w:hAnsi="Times New Roman" w:cs="Times New Roman"/>
+          <w:lang w:val="es-MX"/>
+        </w:rPr>
+        <w:t>Foundation</w:t>
+      </w:r>
+      <w:proofErr w:type="spellEnd"/>
+      <w:r>
+        <w:rPr>
+          <w:rFonts w:ascii="Times New Roman" w:hAnsi="Times New Roman" w:cs="Times New Roman"/>
+          <w:lang w:val="es-MX"/>
+        </w:rPr>
+        <w:t xml:space="preserve">. </w:t>
       </w:r>
       <w:hyperlink r:id="rId10" w:tgtFrame="_blank" w:history="1">
         <w:r>
           <w:rPr>
-            <w:rStyle w:val="Hyperlink"/>
+            <w:rStyle w:val="Hipervnculo"/>
             <w:rFonts w:ascii="Times New Roman" w:hAnsi="Times New Roman" w:cs="Times New Roman"/>
-            <w:lang w:val="en-US"/>
+            <w:lang w:val="es-MX"/>
           </w:rPr>
           <w:t>https://docs.python.org/es/3.12/tutorial/errors.html</w:t>
         </w:r>
@@ -1059,7 +1049,7 @@
       <w:hyperlink r:id="rId11" w:tgtFrame="_blank" w:history="1">
         <w:r>
           <w:rPr>
-            <w:rStyle w:val="Hyperlink"/>
+            <w:rStyle w:val="Hipervnculo"/>
             <w:rFonts w:ascii="Times New Roman" w:hAnsi="Times New Roman" w:cs="Times New Roman"/>
           </w:rPr>
           <w:t>https://repository.unad.edu.co/handle/10596/75876</w:t>
@@ -1084,7 +1074,7 @@
 </file>
 
 <file path=word/endnotes.xml><?xml version="1.0" encoding="utf-8"?>
-<w:endnotes xmlns:wpc="http://schemas.microsoft.com/office/word/2010/wordprocessingCanvas" xmlns:cx="http://schemas.microsoft.com/office/drawing/2014/chartex" xmlns:cx1="http://schemas.microsoft.com/office/drawing/2015/9/8/chartex" xmlns:cx2="http://schemas.microsoft.com/office/drawing/2015/10/21/chartex" xmlns:cx3="http://schemas.microsoft.com/office/drawing/2016/5/9/chartex" xmlns:cx4="http://schemas.microsoft.com/office/drawing/2016/5/10/chartex" xmlns:cx5="http://schemas.microsoft.com/office/drawing/2016/5/11/chartex" xmlns:cx6="http://schemas.microsoft.com/office/drawing/2016/5/12/chartex" xmlns:cx7="http://schemas.microsoft.com/office/drawing/2016/5/13/chartex" xmlns:cx8="http://schemas.microsoft.com/office/drawing/2016/5/14/chartex" xmlns:mc="http://schemas.openxmlformats.org/markup-compatibility/2006" xmlns:aink="http://schemas.microsoft.com/office/drawing/2016/ink" xmlns:am3d="http://schemas.microsoft.com/office/drawing/2017/model3d" xmlns:o="urn:schemas-microsoft-com:office:office" xmlns:oel="http://schemas.microsoft.com/office/2019/extlst" xmlns:r="http://schemas.openxmlformats.org/officeDocument/2006/relationships" xmlns:m="http://schemas.openxmlformats.org/officeDocument/2006/math" xmlns:v="urn:schemas-microsoft-com:vml" xmlns:wp14="http://schemas.microsoft.com/office/word/2010/wordprocessingDrawing" xmlns:wp="http://schemas.openxmlformats.org/drawingml/2006/wordprocessingDrawing" xmlns:w10="urn:schemas-microsoft-com:office:word" xmlns:w="http://schemas.openxmlformats.org/wordprocessingml/2006/main" xmlns:w14="http://schemas.microsoft.com/office/word/2010/wordml" xmlns:w15="http://schemas.microsoft.com/office/word/2012/wordml" xmlns:w16cex="http://schemas.microsoft.com/office/word/2018/wordml/cex" xmlns:w16cid="http://schemas.microsoft.com/office/word/2016/wordml/cid" xmlns:w16="http://schemas.microsoft.com/office/word/2018/wordml" xmlns:w16du="http://schemas.microsoft.com/office/word/2023/wordml/word16du" xmlns:w16sdtdh="http://schemas.microsoft.com/office/word/2020/wordml/sdtdatahash" xmlns:w16sdtfl="http://schemas.microsoft.com/office/word/2024/wordml/sdtformatlock" xmlns:w16se="http://schemas.microsoft.com/office/word/2015/wordml/symex" xmlns:wpg="http://schemas.microsoft.com/office/word/2010/wordprocessingGroup" xmlns:wpi="http://schemas.microsoft.com/office/word/2010/wordprocessingInk" xmlns:wne="http://schemas.microsoft.com/office/word/2006/wordml" xmlns:wps="http://schemas.microsoft.com/office/word/2010/wordprocessingShape" mc:Ignorable="w14 w15 w16se w16cid w16 w16cex w16sdtdh w16sdtfl w16du wp14">
+<w:endnotes xmlns:wpc="http://schemas.microsoft.com/office/word/2010/wordprocessingCanvas" xmlns:cx="http://schemas.microsoft.com/office/drawing/2014/chartex" xmlns:mc="http://schemas.openxmlformats.org/markup-compatibility/2006" xmlns:o="urn:schemas-microsoft-com:office:office" xmlns:r="http://schemas.openxmlformats.org/officeDocument/2006/relationships" xmlns:m="http://schemas.openxmlformats.org/officeDocument/2006/math" xmlns:v="urn:schemas-microsoft-com:vml" xmlns:wp14="http://schemas.microsoft.com/office/word/2010/wordprocessingDrawing" xmlns:wp="http://schemas.openxmlformats.org/drawingml/2006/wordprocessingDrawing" xmlns:w10="urn:schemas-microsoft-com:office:word" xmlns:w="http://schemas.openxmlformats.org/wordprocessingml/2006/main" xmlns:w14="http://schemas.microsoft.com/office/word/2010/wordml" xmlns:w15="http://schemas.microsoft.com/office/word/2012/wordml" xmlns:w16se="http://schemas.microsoft.com/office/word/2015/wordml/symex" xmlns:wpg="http://schemas.microsoft.com/office/word/2010/wordprocessingGroup" xmlns:wpi="http://schemas.microsoft.com/office/word/2010/wordprocessingInk" xmlns:wne="http://schemas.microsoft.com/office/word/2006/wordml" xmlns:wps="http://schemas.microsoft.com/office/word/2010/wordprocessingShape" mc:Ignorable="w14 w15 w16se wp14">
   <w:endnote w:type="separator" w:id="-1">
     <w:p>
       <w:pPr>
@@ -1109,15 +1099,16 @@
 </file>
 
 <file path=word/footer1.xml><?xml version="1.0" encoding="utf-8"?>
-<w:ftr xmlns:wpc="http://schemas.microsoft.com/office/word/2010/wordprocessingCanvas" xmlns:cx="http://schemas.microsoft.com/office/drawing/2014/chartex" xmlns:cx1="http://schemas.microsoft.com/office/drawing/2015/9/8/chartex" xmlns:cx2="http://schemas.microsoft.com/office/drawing/2015/10/21/chartex" xmlns:cx3="http://schemas.microsoft.com/office/drawing/2016/5/9/chartex" xmlns:cx4="http://schemas.microsoft.com/office/drawing/2016/5/10/chartex" xmlns:cx5="http://schemas.microsoft.com/office/drawing/2016/5/11/chartex" xmlns:cx6="http://schemas.microsoft.com/office/drawing/2016/5/12/chartex" xmlns:cx7="http://schemas.microsoft.com/office/drawing/2016/5/13/chartex" xmlns:cx8="http://schemas.microsoft.com/office/drawing/2016/5/14/chartex" xmlns:mc="http://schemas.openxmlformats.org/markup-compatibility/2006" xmlns:aink="http://schemas.microsoft.com/office/drawing/2016/ink" xmlns:am3d="http://schemas.microsoft.com/office/drawing/2017/model3d" xmlns:o="urn:schemas-microsoft-com:office:office" xmlns:oel="http://schemas.microsoft.com/office/2019/extlst" xmlns:r="http://schemas.openxmlformats.org/officeDocument/2006/relationships" xmlns:m="http://schemas.openxmlformats.org/officeDocument/2006/math" xmlns:v="urn:schemas-microsoft-com:vml" xmlns:wp14="http://schemas.microsoft.com/office/word/2010/wordprocessingDrawing" xmlns:wp="http://schemas.openxmlformats.org/drawingml/2006/wordprocessingDrawing" xmlns:w10="urn:schemas-microsoft-com:office:word" xmlns:w="http://schemas.openxmlformats.org/wordprocessingml/2006/main" xmlns:w14="http://schemas.microsoft.com/office/word/2010/wordml" xmlns:w15="http://schemas.microsoft.com/office/word/2012/wordml" xmlns:w16cex="http://schemas.microsoft.com/office/word/2018/wordml/cex" xmlns:w16cid="http://schemas.microsoft.com/office/word/2016/wordml/cid" xmlns:w16="http://schemas.microsoft.com/office/word/2018/wordml" xmlns:w16du="http://schemas.microsoft.com/office/word/2023/wordml/word16du" xmlns:w16sdtdh="http://schemas.microsoft.com/office/word/2020/wordml/sdtdatahash" xmlns:w16sdtfl="http://schemas.microsoft.com/office/word/2024/wordml/sdtformatlock" xmlns:w16se="http://schemas.microsoft.com/office/word/2015/wordml/symex" xmlns:wpg="http://schemas.microsoft.com/office/word/2010/wordprocessingGroup" xmlns:wpi="http://schemas.microsoft.com/office/word/2010/wordprocessingInk" xmlns:wne="http://schemas.microsoft.com/office/word/2006/wordml" xmlns:wps="http://schemas.microsoft.com/office/word/2010/wordprocessingShape" mc:Ignorable="w14 w15 w16se w16cid w16 w16cex w16sdtdh w16sdtfl w16du wp14">
+<w:ftr xmlns:wpc="http://schemas.microsoft.com/office/word/2010/wordprocessingCanvas" xmlns:cx="http://schemas.microsoft.com/office/drawing/2014/chartex" xmlns:mc="http://schemas.openxmlformats.org/markup-compatibility/2006" xmlns:o="urn:schemas-microsoft-com:office:office" xmlns:r="http://schemas.openxmlformats.org/officeDocument/2006/relationships" xmlns:m="http://schemas.openxmlformats.org/officeDocument/2006/math" xmlns:v="urn:schemas-microsoft-com:vml" xmlns:wp14="http://schemas.microsoft.com/office/word/2010/wordprocessingDrawing" xmlns:wp="http://schemas.openxmlformats.org/drawingml/2006/wordprocessingDrawing" xmlns:w10="urn:schemas-microsoft-com:office:word" xmlns:w="http://schemas.openxmlformats.org/wordprocessingml/2006/main" xmlns:w14="http://schemas.microsoft.com/office/word/2010/wordml" xmlns:w15="http://schemas.microsoft.com/office/word/2012/wordml" xmlns:w16se="http://schemas.microsoft.com/office/word/2015/wordml/symex" xmlns:wpg="http://schemas.microsoft.com/office/word/2010/wordprocessingGroup" xmlns:wpi="http://schemas.microsoft.com/office/word/2010/wordprocessingInk" xmlns:wne="http://schemas.microsoft.com/office/word/2006/wordml" xmlns:wps="http://schemas.microsoft.com/office/word/2010/wordprocessingShape" mc:Ignorable="w14 w15 w16se wp14">
   <w:p>
     <w:pPr>
-      <w:pStyle w:val="Footer"/>
+      <w:pStyle w:val="Piedepgina"/>
     </w:pPr>
     <w:r>
       <w:rPr>
         <w:noProof/>
         <w:sz w:val="20"/>
+        <w:lang w:val="en-US"/>
       </w:rPr>
       <w:drawing>
         <wp:anchor distT="0" distB="0" distL="0" distR="0" simplePos="0" relativeHeight="251661312" behindDoc="1" locked="0" layoutInCell="1" allowOverlap="1" wp14:anchorId="612E98E2" wp14:editId="53ABF483">
@@ -1168,7 +1159,7 @@
 </file>
 
 <file path=word/footnotes.xml><?xml version="1.0" encoding="utf-8"?>
-<w:footnotes xmlns:wpc="http://schemas.microsoft.com/office/word/2010/wordprocessingCanvas" xmlns:cx="http://schemas.microsoft.com/office/drawing/2014/chartex" xmlns:cx1="http://schemas.microsoft.com/office/drawing/2015/9/8/chartex" xmlns:cx2="http://schemas.microsoft.com/office/drawing/2015/10/21/chartex" xmlns:cx3="http://schemas.microsoft.com/office/drawing/2016/5/9/chartex" xmlns:cx4="http://schemas.microsoft.com/office/drawing/2016/5/10/chartex" xmlns:cx5="http://schemas.microsoft.com/office/drawing/2016/5/11/chartex" xmlns:cx6="http://schemas.microsoft.com/office/drawing/2016/5/12/chartex" xmlns:cx7="http://schemas.microsoft.com/office/drawing/2016/5/13/chartex" xmlns:cx8="http://schemas.microsoft.com/office/drawing/2016/5/14/chartex" xmlns:mc="http://schemas.openxmlformats.org/markup-compatibility/2006" xmlns:aink="http://schemas.microsoft.com/office/drawing/2016/ink" xmlns:am3d="http://schemas.microsoft.com/office/drawing/2017/model3d" xmlns:o="urn:schemas-microsoft-com:office:office" xmlns:oel="http://schemas.microsoft.com/office/2019/extlst" xmlns:r="http://schemas.openxmlformats.org/officeDocument/2006/relationships" xmlns:m="http://schemas.openxmlformats.org/officeDocument/2006/math" xmlns:v="urn:schemas-microsoft-com:vml" xmlns:wp14="http://schemas.microsoft.com/office/word/2010/wordprocessingDrawing" xmlns:wp="http://schemas.openxmlformats.org/drawingml/2006/wordprocessingDrawing" xmlns:w10="urn:schemas-microsoft-com:office:word" xmlns:w="http://schemas.openxmlformats.org/wordprocessingml/2006/main" xmlns:w14="http://schemas.microsoft.com/office/word/2010/wordml" xmlns:w15="http://schemas.microsoft.com/office/word/2012/wordml" xmlns:w16cex="http://schemas.microsoft.com/office/word/2018/wordml/cex" xmlns:w16cid="http://schemas.microsoft.com/office/word/2016/wordml/cid" xmlns:w16="http://schemas.microsoft.com/office/word/2018/wordml" xmlns:w16du="http://schemas.microsoft.com/office/word/2023/wordml/word16du" xmlns:w16sdtdh="http://schemas.microsoft.com/office/word/2020/wordml/sdtdatahash" xmlns:w16sdtfl="http://schemas.microsoft.com/office/word/2024/wordml/sdtformatlock" xmlns:w16se="http://schemas.microsoft.com/office/word/2015/wordml/symex" xmlns:wpg="http://schemas.microsoft.com/office/word/2010/wordprocessingGroup" xmlns:wpi="http://schemas.microsoft.com/office/word/2010/wordprocessingInk" xmlns:wne="http://schemas.microsoft.com/office/word/2006/wordml" xmlns:wps="http://schemas.microsoft.com/office/word/2010/wordprocessingShape" mc:Ignorable="w14 w15 w16se w16cid w16 w16cex w16sdtdh w16sdtfl w16du wp14">
+<w:footnotes xmlns:wpc="http://schemas.microsoft.com/office/word/2010/wordprocessingCanvas" xmlns:cx="http://schemas.microsoft.com/office/drawing/2014/chartex" xmlns:mc="http://schemas.openxmlformats.org/markup-compatibility/2006" xmlns:o="urn:schemas-microsoft-com:office:office" xmlns:r="http://schemas.openxmlformats.org/officeDocument/2006/relationships" xmlns:m="http://schemas.openxmlformats.org/officeDocument/2006/math" xmlns:v="urn:schemas-microsoft-com:vml" xmlns:wp14="http://schemas.microsoft.com/office/word/2010/wordprocessingDrawing" xmlns:wp="http://schemas.openxmlformats.org/drawingml/2006/wordprocessingDrawing" xmlns:w10="urn:schemas-microsoft-com:office:word" xmlns:w="http://schemas.openxmlformats.org/wordprocessingml/2006/main" xmlns:w14="http://schemas.microsoft.com/office/word/2010/wordml" xmlns:w15="http://schemas.microsoft.com/office/word/2012/wordml" xmlns:w16se="http://schemas.microsoft.com/office/word/2015/wordml/symex" xmlns:wpg="http://schemas.microsoft.com/office/word/2010/wordprocessingGroup" xmlns:wpi="http://schemas.microsoft.com/office/word/2010/wordprocessingInk" xmlns:wne="http://schemas.microsoft.com/office/word/2006/wordml" xmlns:wps="http://schemas.microsoft.com/office/word/2010/wordprocessingShape" mc:Ignorable="w14 w15 w16se wp14">
   <w:footnote w:type="separator" w:id="-1">
     <w:p>
       <w:pPr>
@@ -1193,15 +1184,16 @@
 </file>
 
 <file path=word/header1.xml><?xml version="1.0" encoding="utf-8"?>
-<w:hdr xmlns:wpc="http://schemas.microsoft.com/office/word/2010/wordprocessingCanvas" xmlns:cx="http://schemas.microsoft.com/office/drawing/2014/chartex" xmlns:cx1="http://schemas.microsoft.com/office/drawing/2015/9/8/chartex" xmlns:cx2="http://schemas.microsoft.com/office/drawing/2015/10/21/chartex" xmlns:cx3="http://schemas.microsoft.com/office/drawing/2016/5/9/chartex" xmlns:cx4="http://schemas.microsoft.com/office/drawing/2016/5/10/chartex" xmlns:cx5="http://schemas.microsoft.com/office/drawing/2016/5/11/chartex" xmlns:cx6="http://schemas.microsoft.com/office/drawing/2016/5/12/chartex" xmlns:cx7="http://schemas.microsoft.com/office/drawing/2016/5/13/chartex" xmlns:cx8="http://schemas.microsoft.com/office/drawing/2016/5/14/chartex" xmlns:mc="http://schemas.openxmlformats.org/markup-compatibility/2006" xmlns:aink="http://schemas.microsoft.com/office/drawing/2016/ink" xmlns:am3d="http://schemas.microsoft.com/office/drawing/2017/model3d" xmlns:o="urn:schemas-microsoft-com:office:office" xmlns:oel="http://schemas.microsoft.com/office/2019/extlst" xmlns:r="http://schemas.openxmlformats.org/officeDocument/2006/relationships" xmlns:m="http://schemas.openxmlformats.org/officeDocument/2006/math" xmlns:v="urn:schemas-microsoft-com:vml" xmlns:wp14="http://schemas.microsoft.com/office/word/2010/wordprocessingDrawing" xmlns:wp="http://schemas.openxmlformats.org/drawingml/2006/wordprocessingDrawing" xmlns:w10="urn:schemas-microsoft-com:office:word" xmlns:w="http://schemas.openxmlformats.org/wordprocessingml/2006/main" xmlns:w14="http://schemas.microsoft.com/office/word/2010/wordml" xmlns:w15="http://schemas.microsoft.com/office/word/2012/wordml" xmlns:w16cex="http://schemas.microsoft.com/office/word/2018/wordml/cex" xmlns:w16cid="http://schemas.microsoft.com/office/word/2016/wordml/cid" xmlns:w16="http://schemas.microsoft.com/office/word/2018/wordml" xmlns:w16du="http://schemas.microsoft.com/office/word/2023/wordml/word16du" xmlns:w16sdtdh="http://schemas.microsoft.com/office/word/2020/wordml/sdtdatahash" xmlns:w16sdtfl="http://schemas.microsoft.com/office/word/2024/wordml/sdtformatlock" xmlns:w16se="http://schemas.microsoft.com/office/word/2015/wordml/symex" xmlns:wpg="http://schemas.microsoft.com/office/word/2010/wordprocessingGroup" xmlns:wpi="http://schemas.microsoft.com/office/word/2010/wordprocessingInk" xmlns:wne="http://schemas.microsoft.com/office/word/2006/wordml" xmlns:wps="http://schemas.microsoft.com/office/word/2010/wordprocessingShape" mc:Ignorable="w14 w15 w16se w16cid w16 w16cex w16sdtdh w16sdtfl w16du wp14">
+<w:hdr xmlns:wpc="http://schemas.microsoft.com/office/word/2010/wordprocessingCanvas" xmlns:cx="http://schemas.microsoft.com/office/drawing/2014/chartex" xmlns:mc="http://schemas.openxmlformats.org/markup-compatibility/2006" xmlns:o="urn:schemas-microsoft-com:office:office" xmlns:r="http://schemas.openxmlformats.org/officeDocument/2006/relationships" xmlns:m="http://schemas.openxmlformats.org/officeDocument/2006/math" xmlns:v="urn:schemas-microsoft-com:vml" xmlns:wp14="http://schemas.microsoft.com/office/word/2010/wordprocessingDrawing" xmlns:wp="http://schemas.openxmlformats.org/drawingml/2006/wordprocessingDrawing" xmlns:w10="urn:schemas-microsoft-com:office:word" xmlns:w="http://schemas.openxmlformats.org/wordprocessingml/2006/main" xmlns:w14="http://schemas.microsoft.com/office/word/2010/wordml" xmlns:w15="http://schemas.microsoft.com/office/word/2012/wordml" xmlns:w16se="http://schemas.microsoft.com/office/word/2015/wordml/symex" xmlns:wpg="http://schemas.microsoft.com/office/word/2010/wordprocessingGroup" xmlns:wpi="http://schemas.microsoft.com/office/word/2010/wordprocessingInk" xmlns:wne="http://schemas.microsoft.com/office/word/2006/wordml" xmlns:wps="http://schemas.microsoft.com/office/word/2010/wordprocessingShape" mc:Ignorable="w14 w15 w16se wp14">
   <w:p>
     <w:pPr>
-      <w:pStyle w:val="Header"/>
+      <w:pStyle w:val="Encabezado"/>
     </w:pPr>
     <w:r>
       <w:rPr>
         <w:noProof/>
         <w:sz w:val="20"/>
+        <w:lang w:val="en-US"/>
       </w:rPr>
       <w:drawing>
         <wp:anchor distT="0" distB="0" distL="0" distR="0" simplePos="0" relativeHeight="251659264" behindDoc="1" locked="0" layoutInCell="1" allowOverlap="1" wp14:anchorId="10BE867E" wp14:editId="783A3D40">
@@ -1255,7 +1247,7 @@
 </file>
 
 <file path=word/styles.xml><?xml version="1.0" encoding="utf-8"?>
-<w:styles xmlns:mc="http://schemas.openxmlformats.org/markup-compatibility/2006" xmlns:r="http://schemas.openxmlformats.org/officeDocument/2006/relationships" xmlns:w="http://schemas.openxmlformats.org/wordprocessingml/2006/main" xmlns:w14="http://schemas.microsoft.com/office/word/2010/wordml" xmlns:w15="http://schemas.microsoft.com/office/word/2012/wordml" xmlns:w16cex="http://schemas.microsoft.com/office/word/2018/wordml/cex" xmlns:w16cid="http://schemas.microsoft.com/office/word/2016/wordml/cid" xmlns:w16="http://schemas.microsoft.com/office/word/2018/wordml" xmlns:w16du="http://schemas.microsoft.com/office/word/2023/wordml/word16du" xmlns:w16sdtdh="http://schemas.microsoft.com/office/word/2020/wordml/sdtdatahash" xmlns:w16sdtfl="http://schemas.microsoft.com/office/word/2024/wordml/sdtformatlock" xmlns:w16se="http://schemas.microsoft.com/office/word/2015/wordml/symex" mc:Ignorable="w14 w15 w16se w16cid w16 w16cex w16sdtdh w16sdtfl w16du">
+<w:styles xmlns:mc="http://schemas.openxmlformats.org/markup-compatibility/2006" xmlns:r="http://schemas.openxmlformats.org/officeDocument/2006/relationships" xmlns:w="http://schemas.openxmlformats.org/wordprocessingml/2006/main" xmlns:w14="http://schemas.microsoft.com/office/word/2010/wordml" xmlns:w15="http://schemas.microsoft.com/office/word/2012/wordml" xmlns:w16se="http://schemas.microsoft.com/office/word/2015/wordml/symex" mc:Ignorable="w14 w15 w16se">
   <w:docDefaults>
     <w:rPrDefault>
       <w:rPr>
@@ -1273,7 +1265,7 @@
       </w:pPr>
     </w:pPrDefault>
   </w:docDefaults>
-  <w:latentStyles w:defLockedState="0" w:defUIPriority="99" w:defSemiHidden="0" w:defUnhideWhenUsed="0" w:defQFormat="0" w:count="376">
+  <w:latentStyles w:defLockedState="0" w:defUIPriority="99" w:defSemiHidden="0" w:defUnhideWhenUsed="0" w:defQFormat="0" w:count="371">
     <w:lsdException w:name="Normal" w:uiPriority="0" w:qFormat="1"/>
     <w:lsdException w:name="heading 1" w:uiPriority="9" w:qFormat="1"/>
     <w:lsdException w:name="heading 2" w:semiHidden="1" w:uiPriority="9" w:unhideWhenUsed="1" w:qFormat="1"/>
@@ -1645,11 +1637,6 @@
     <w:lsdException w:name="List Table 5 Dark Accent 6" w:uiPriority="50"/>
     <w:lsdException w:name="List Table 6 Colorful Accent 6" w:uiPriority="51"/>
     <w:lsdException w:name="List Table 7 Colorful Accent 6" w:uiPriority="52"/>
-    <w:lsdException w:name="Mention" w:semiHidden="1" w:unhideWhenUsed="1"/>
-    <w:lsdException w:name="Smart Hyperlink" w:semiHidden="1" w:unhideWhenUsed="1"/>
-    <w:lsdException w:name="Hashtag" w:semiHidden="1" w:unhideWhenUsed="1"/>
-    <w:lsdException w:name="Unresolved Mention" w:semiHidden="1" w:unhideWhenUsed="1"/>
-    <w:lsdException w:name="Smart Link" w:semiHidden="1" w:unhideWhenUsed="1"/>
   </w:latentStyles>
   <w:style w:type="paragraph" w:default="1" w:styleId="Normal">
     <w:name w:val="Normal"/>
@@ -1659,11 +1646,11 @@
       <w:lang w:val="es-419"/>
     </w:rPr>
   </w:style>
-  <w:style w:type="paragraph" w:styleId="Heading1">
+  <w:style w:type="paragraph" w:styleId="Ttulo1">
     <w:name w:val="heading 1"/>
     <w:basedOn w:val="Normal"/>
     <w:next w:val="Normal"/>
-    <w:link w:val="Heading1Char"/>
+    <w:link w:val="Ttulo1Car"/>
     <w:uiPriority w:val="9"/>
     <w:qFormat/>
     <w:rsid w:val="007F7608"/>
@@ -1680,11 +1667,11 @@
       <w:szCs w:val="40"/>
     </w:rPr>
   </w:style>
-  <w:style w:type="paragraph" w:styleId="Heading2">
+  <w:style w:type="paragraph" w:styleId="Ttulo2">
     <w:name w:val="heading 2"/>
     <w:basedOn w:val="Normal"/>
     <w:next w:val="Normal"/>
-    <w:link w:val="Heading2Char"/>
+    <w:link w:val="Ttulo2Car"/>
     <w:uiPriority w:val="9"/>
     <w:semiHidden/>
     <w:unhideWhenUsed/>
@@ -1703,11 +1690,11 @@
       <w:szCs w:val="32"/>
     </w:rPr>
   </w:style>
-  <w:style w:type="paragraph" w:styleId="Heading3">
+  <w:style w:type="paragraph" w:styleId="Ttulo3">
     <w:name w:val="heading 3"/>
     <w:basedOn w:val="Normal"/>
     <w:next w:val="Normal"/>
-    <w:link w:val="Heading3Char"/>
+    <w:link w:val="Ttulo3Car"/>
     <w:uiPriority w:val="9"/>
     <w:semiHidden/>
     <w:unhideWhenUsed/>
@@ -1726,11 +1713,11 @@
       <w:szCs w:val="28"/>
     </w:rPr>
   </w:style>
-  <w:style w:type="paragraph" w:styleId="Heading4">
+  <w:style w:type="paragraph" w:styleId="Ttulo4">
     <w:name w:val="heading 4"/>
     <w:basedOn w:val="Normal"/>
     <w:next w:val="Normal"/>
-    <w:link w:val="Heading4Char"/>
+    <w:link w:val="Ttulo4Car"/>
     <w:uiPriority w:val="9"/>
     <w:semiHidden/>
     <w:unhideWhenUsed/>
@@ -1749,11 +1736,11 @@
       <w:color w:val="0F4761" w:themeColor="accent1" w:themeShade="BF"/>
     </w:rPr>
   </w:style>
-  <w:style w:type="paragraph" w:styleId="Heading5">
+  <w:style w:type="paragraph" w:styleId="Ttulo5">
     <w:name w:val="heading 5"/>
     <w:basedOn w:val="Normal"/>
     <w:next w:val="Normal"/>
-    <w:link w:val="Heading5Char"/>
+    <w:link w:val="Ttulo5Car"/>
     <w:uiPriority w:val="9"/>
     <w:semiHidden/>
     <w:unhideWhenUsed/>
@@ -1770,11 +1757,11 @@
       <w:color w:val="0F4761" w:themeColor="accent1" w:themeShade="BF"/>
     </w:rPr>
   </w:style>
-  <w:style w:type="paragraph" w:styleId="Heading6">
+  <w:style w:type="paragraph" w:styleId="Ttulo6">
     <w:name w:val="heading 6"/>
     <w:basedOn w:val="Normal"/>
     <w:next w:val="Normal"/>
-    <w:link w:val="Heading6Char"/>
+    <w:link w:val="Ttulo6Car"/>
     <w:uiPriority w:val="9"/>
     <w:semiHidden/>
     <w:unhideWhenUsed/>
@@ -1793,11 +1780,11 @@
       <w:color w:val="595959" w:themeColor="text1" w:themeTint="A6"/>
     </w:rPr>
   </w:style>
-  <w:style w:type="paragraph" w:styleId="Heading7">
+  <w:style w:type="paragraph" w:styleId="Ttulo7">
     <w:name w:val="heading 7"/>
     <w:basedOn w:val="Normal"/>
     <w:next w:val="Normal"/>
-    <w:link w:val="Heading7Char"/>
+    <w:link w:val="Ttulo7Car"/>
     <w:uiPriority w:val="9"/>
     <w:semiHidden/>
     <w:unhideWhenUsed/>
@@ -1814,11 +1801,11 @@
       <w:color w:val="595959" w:themeColor="text1" w:themeTint="A6"/>
     </w:rPr>
   </w:style>
-  <w:style w:type="paragraph" w:styleId="Heading8">
+  <w:style w:type="paragraph" w:styleId="Ttulo8">
     <w:name w:val="heading 8"/>
     <w:basedOn w:val="Normal"/>
     <w:next w:val="Normal"/>
-    <w:link w:val="Heading8Char"/>
+    <w:link w:val="Ttulo8Car"/>
     <w:uiPriority w:val="9"/>
     <w:semiHidden/>
     <w:unhideWhenUsed/>
@@ -1837,11 +1824,11 @@
       <w:color w:val="272727" w:themeColor="text1" w:themeTint="D8"/>
     </w:rPr>
   </w:style>
-  <w:style w:type="paragraph" w:styleId="Heading9">
+  <w:style w:type="paragraph" w:styleId="Ttulo9">
     <w:name w:val="heading 9"/>
     <w:basedOn w:val="Normal"/>
     <w:next w:val="Normal"/>
-    <w:link w:val="Heading9Char"/>
+    <w:link w:val="Ttulo9Car"/>
     <w:uiPriority w:val="9"/>
     <w:semiHidden/>
     <w:unhideWhenUsed/>
@@ -1858,12 +1845,13 @@
       <w:color w:val="272727" w:themeColor="text1" w:themeTint="D8"/>
     </w:rPr>
   </w:style>
-  <w:style w:type="character" w:default="1" w:styleId="DefaultParagraphFont">
+  <w:style w:type="character" w:default="1" w:styleId="Fuentedeprrafopredeter">
     <w:name w:val="Default Paragraph Font"/>
     <w:uiPriority w:val="1"/>
+    <w:semiHidden/>
     <w:unhideWhenUsed/>
   </w:style>
-  <w:style w:type="table" w:default="1" w:styleId="TableNormal">
+  <w:style w:type="table" w:default="1" w:styleId="Tablanormal">
     <w:name w:val="Normal Table"/>
     <w:uiPriority w:val="99"/>
     <w:semiHidden/>
@@ -1878,16 +1866,16 @@
       </w:tblCellMar>
     </w:tblPr>
   </w:style>
-  <w:style w:type="numbering" w:default="1" w:styleId="NoList">
+  <w:style w:type="numbering" w:default="1" w:styleId="Sinlista">
     <w:name w:val="No List"/>
     <w:uiPriority w:val="99"/>
     <w:semiHidden/>
     <w:unhideWhenUsed/>
   </w:style>
-  <w:style w:type="character" w:customStyle="1" w:styleId="Heading1Char">
-    <w:name w:val="Heading 1 Char"/>
-    <w:basedOn w:val="DefaultParagraphFont"/>
-    <w:link w:val="Heading1"/>
+  <w:style w:type="character" w:customStyle="1" w:styleId="Ttulo1Car">
+    <w:name w:val="Título 1 Car"/>
+    <w:basedOn w:val="Fuentedeprrafopredeter"/>
+    <w:link w:val="Ttulo1"/>
     <w:uiPriority w:val="9"/>
     <w:rsid w:val="007F7608"/>
     <w:rPr>
@@ -1897,10 +1885,10 @@
       <w:szCs w:val="40"/>
     </w:rPr>
   </w:style>
-  <w:style w:type="character" w:customStyle="1" w:styleId="Heading2Char">
-    <w:name w:val="Heading 2 Char"/>
-    <w:basedOn w:val="DefaultParagraphFont"/>
-    <w:link w:val="Heading2"/>
+  <w:style w:type="character" w:customStyle="1" w:styleId="Ttulo2Car">
+    <w:name w:val="Título 2 Car"/>
+    <w:basedOn w:val="Fuentedeprrafopredeter"/>
+    <w:link w:val="Ttulo2"/>
     <w:uiPriority w:val="9"/>
     <w:semiHidden/>
     <w:rsid w:val="007F7608"/>
@@ -1911,10 +1899,10 @@
       <w:szCs w:val="32"/>
     </w:rPr>
   </w:style>
-  <w:style w:type="character" w:customStyle="1" w:styleId="Heading3Char">
-    <w:name w:val="Heading 3 Char"/>
-    <w:basedOn w:val="DefaultParagraphFont"/>
-    <w:link w:val="Heading3"/>
+  <w:style w:type="character" w:customStyle="1" w:styleId="Ttulo3Car">
+    <w:name w:val="Título 3 Car"/>
+    <w:basedOn w:val="Fuentedeprrafopredeter"/>
+    <w:link w:val="Ttulo3"/>
     <w:uiPriority w:val="9"/>
     <w:semiHidden/>
     <w:rsid w:val="007F7608"/>
@@ -1925,10 +1913,10 @@
       <w:szCs w:val="28"/>
     </w:rPr>
   </w:style>
-  <w:style w:type="character" w:customStyle="1" w:styleId="Heading4Char">
-    <w:name w:val="Heading 4 Char"/>
-    <w:basedOn w:val="DefaultParagraphFont"/>
-    <w:link w:val="Heading4"/>
+  <w:style w:type="character" w:customStyle="1" w:styleId="Ttulo4Car">
+    <w:name w:val="Título 4 Car"/>
+    <w:basedOn w:val="Fuentedeprrafopredeter"/>
+    <w:link w:val="Ttulo4"/>
     <w:uiPriority w:val="9"/>
     <w:semiHidden/>
     <w:rsid w:val="007F7608"/>
@@ -1939,10 +1927,10 @@
       <w:color w:val="0F4761" w:themeColor="accent1" w:themeShade="BF"/>
     </w:rPr>
   </w:style>
-  <w:style w:type="character" w:customStyle="1" w:styleId="Heading5Char">
-    <w:name w:val="Heading 5 Char"/>
-    <w:basedOn w:val="DefaultParagraphFont"/>
-    <w:link w:val="Heading5"/>
+  <w:style w:type="character" w:customStyle="1" w:styleId="Ttulo5Car">
+    <w:name w:val="Título 5 Car"/>
+    <w:basedOn w:val="Fuentedeprrafopredeter"/>
+    <w:link w:val="Ttulo5"/>
     <w:uiPriority w:val="9"/>
     <w:semiHidden/>
     <w:rsid w:val="007F7608"/>
@@ -1951,10 +1939,10 @@
       <w:color w:val="0F4761" w:themeColor="accent1" w:themeShade="BF"/>
     </w:rPr>
   </w:style>
-  <w:style w:type="character" w:customStyle="1" w:styleId="Heading6Char">
-    <w:name w:val="Heading 6 Char"/>
-    <w:basedOn w:val="DefaultParagraphFont"/>
-    <w:link w:val="Heading6"/>
+  <w:style w:type="character" w:customStyle="1" w:styleId="Ttulo6Car">
+    <w:name w:val="Título 6 Car"/>
+    <w:basedOn w:val="Fuentedeprrafopredeter"/>
+    <w:link w:val="Ttulo6"/>
     <w:uiPriority w:val="9"/>
     <w:semiHidden/>
     <w:rsid w:val="007F7608"/>
@@ -1965,10 +1953,10 @@
       <w:color w:val="595959" w:themeColor="text1" w:themeTint="A6"/>
     </w:rPr>
   </w:style>
-  <w:style w:type="character" w:customStyle="1" w:styleId="Heading7Char">
-    <w:name w:val="Heading 7 Char"/>
-    <w:basedOn w:val="DefaultParagraphFont"/>
-    <w:link w:val="Heading7"/>
+  <w:style w:type="character" w:customStyle="1" w:styleId="Ttulo7Car">
+    <w:name w:val="Título 7 Car"/>
+    <w:basedOn w:val="Fuentedeprrafopredeter"/>
+    <w:link w:val="Ttulo7"/>
     <w:uiPriority w:val="9"/>
     <w:semiHidden/>
     <w:rsid w:val="007F7608"/>
@@ -1977,10 +1965,10 @@
       <w:color w:val="595959" w:themeColor="text1" w:themeTint="A6"/>
     </w:rPr>
   </w:style>
-  <w:style w:type="character" w:customStyle="1" w:styleId="Heading8Char">
-    <w:name w:val="Heading 8 Char"/>
-    <w:basedOn w:val="DefaultParagraphFont"/>
-    <w:link w:val="Heading8"/>
+  <w:style w:type="character" w:customStyle="1" w:styleId="Ttulo8Car">
+    <w:name w:val="Título 8 Car"/>
+    <w:basedOn w:val="Fuentedeprrafopredeter"/>
+    <w:link w:val="Ttulo8"/>
     <w:uiPriority w:val="9"/>
     <w:semiHidden/>
     <w:rsid w:val="007F7608"/>
@@ -1991,10 +1979,10 @@
       <w:color w:val="272727" w:themeColor="text1" w:themeTint="D8"/>
     </w:rPr>
   </w:style>
-  <w:style w:type="character" w:customStyle="1" w:styleId="Heading9Char">
-    <w:name w:val="Heading 9 Char"/>
-    <w:basedOn w:val="DefaultParagraphFont"/>
-    <w:link w:val="Heading9"/>
+  <w:style w:type="character" w:customStyle="1" w:styleId="Ttulo9Car">
+    <w:name w:val="Título 9 Car"/>
+    <w:basedOn w:val="Fuentedeprrafopredeter"/>
+    <w:link w:val="Ttulo9"/>
     <w:uiPriority w:val="9"/>
     <w:semiHidden/>
     <w:rsid w:val="007F7608"/>
@@ -2003,11 +1991,11 @@
       <w:color w:val="272727" w:themeColor="text1" w:themeTint="D8"/>
     </w:rPr>
   </w:style>
-  <w:style w:type="paragraph" w:styleId="Title">
+  <w:style w:type="paragraph" w:styleId="Ttulo">
     <w:name w:val="Title"/>
     <w:basedOn w:val="Normal"/>
     <w:next w:val="Normal"/>
-    <w:link w:val="TitleChar"/>
+    <w:link w:val="TtuloCar"/>
     <w:uiPriority w:val="10"/>
     <w:qFormat/>
     <w:rsid w:val="007F7608"/>
@@ -2023,10 +2011,10 @@
       <w:szCs w:val="56"/>
     </w:rPr>
   </w:style>
-  <w:style w:type="character" w:customStyle="1" w:styleId="TitleChar">
-    <w:name w:val="Title Char"/>
-    <w:basedOn w:val="DefaultParagraphFont"/>
-    <w:link w:val="Title"/>
+  <w:style w:type="character" w:customStyle="1" w:styleId="TtuloCar">
+    <w:name w:val="Título Car"/>
+    <w:basedOn w:val="Fuentedeprrafopredeter"/>
+    <w:link w:val="Ttulo"/>
     <w:uiPriority w:val="10"/>
     <w:rsid w:val="007F7608"/>
     <w:rPr>
@@ -2037,11 +2025,11 @@
       <w:szCs w:val="56"/>
     </w:rPr>
   </w:style>
-  <w:style w:type="paragraph" w:styleId="Subtitle">
+  <w:style w:type="paragraph" w:styleId="Subttulo">
     <w:name w:val="Subtitle"/>
     <w:basedOn w:val="Normal"/>
     <w:next w:val="Normal"/>
-    <w:link w:val="SubtitleChar"/>
+    <w:link w:val="SubttuloCar"/>
     <w:uiPriority w:val="11"/>
     <w:qFormat/>
     <w:rsid w:val="007F7608"/>
@@ -2058,10 +2046,10 @@
       <w:szCs w:val="28"/>
     </w:rPr>
   </w:style>
-  <w:style w:type="character" w:customStyle="1" w:styleId="SubtitleChar">
-    <w:name w:val="Subtitle Char"/>
-    <w:basedOn w:val="DefaultParagraphFont"/>
-    <w:link w:val="Subtitle"/>
+  <w:style w:type="character" w:customStyle="1" w:styleId="SubttuloCar">
+    <w:name w:val="Subtítulo Car"/>
+    <w:basedOn w:val="Fuentedeprrafopredeter"/>
+    <w:link w:val="Subttulo"/>
     <w:uiPriority w:val="11"/>
     <w:rsid w:val="007F7608"/>
     <w:rPr>
@@ -2072,11 +2060,11 @@
       <w:szCs w:val="28"/>
     </w:rPr>
   </w:style>
-  <w:style w:type="paragraph" w:styleId="Quote">
+  <w:style w:type="paragraph" w:styleId="Cita">
     <w:name w:val="Quote"/>
     <w:basedOn w:val="Normal"/>
     <w:next w:val="Normal"/>
-    <w:link w:val="QuoteChar"/>
+    <w:link w:val="CitaCar"/>
     <w:uiPriority w:val="29"/>
     <w:qFormat/>
     <w:rsid w:val="007F7608"/>
@@ -2090,10 +2078,10 @@
       <w:color w:val="404040" w:themeColor="text1" w:themeTint="BF"/>
     </w:rPr>
   </w:style>
-  <w:style w:type="character" w:customStyle="1" w:styleId="QuoteChar">
-    <w:name w:val="Quote Char"/>
-    <w:basedOn w:val="DefaultParagraphFont"/>
-    <w:link w:val="Quote"/>
+  <w:style w:type="character" w:customStyle="1" w:styleId="CitaCar">
+    <w:name w:val="Cita Car"/>
+    <w:basedOn w:val="Fuentedeprrafopredeter"/>
+    <w:link w:val="Cita"/>
     <w:uiPriority w:val="29"/>
     <w:rsid w:val="007F7608"/>
     <w:rPr>
@@ -2102,7 +2090,7 @@
       <w:color w:val="404040" w:themeColor="text1" w:themeTint="BF"/>
     </w:rPr>
   </w:style>
-  <w:style w:type="paragraph" w:styleId="ListParagraph">
+  <w:style w:type="paragraph" w:styleId="Prrafodelista">
     <w:name w:val="List Paragraph"/>
     <w:basedOn w:val="Normal"/>
     <w:uiPriority w:val="34"/>
@@ -2113,9 +2101,9 @@
       <w:contextualSpacing/>
     </w:pPr>
   </w:style>
-  <w:style w:type="character" w:styleId="IntenseEmphasis">
+  <w:style w:type="character" w:styleId="nfasisintenso">
     <w:name w:val="Intense Emphasis"/>
-    <w:basedOn w:val="DefaultParagraphFont"/>
+    <w:basedOn w:val="Fuentedeprrafopredeter"/>
     <w:uiPriority w:val="21"/>
     <w:qFormat/>
     <w:rsid w:val="007F7608"/>
@@ -2125,11 +2113,11 @@
       <w:color w:val="0F4761" w:themeColor="accent1" w:themeShade="BF"/>
     </w:rPr>
   </w:style>
-  <w:style w:type="paragraph" w:styleId="IntenseQuote">
+  <w:style w:type="paragraph" w:styleId="Citadestacada">
     <w:name w:val="Intense Quote"/>
     <w:basedOn w:val="Normal"/>
     <w:next w:val="Normal"/>
-    <w:link w:val="IntenseQuoteChar"/>
+    <w:link w:val="CitadestacadaCar"/>
     <w:uiPriority w:val="30"/>
     <w:qFormat/>
     <w:rsid w:val="007F7608"/>
@@ -2148,10 +2136,10 @@
       <w:color w:val="0F4761" w:themeColor="accent1" w:themeShade="BF"/>
     </w:rPr>
   </w:style>
-  <w:style w:type="character" w:customStyle="1" w:styleId="IntenseQuoteChar">
-    <w:name w:val="Intense Quote Char"/>
-    <w:basedOn w:val="DefaultParagraphFont"/>
-    <w:link w:val="IntenseQuote"/>
+  <w:style w:type="character" w:customStyle="1" w:styleId="CitadestacadaCar">
+    <w:name w:val="Cita destacada Car"/>
+    <w:basedOn w:val="Fuentedeprrafopredeter"/>
+    <w:link w:val="Citadestacada"/>
     <w:uiPriority w:val="30"/>
     <w:rsid w:val="007F7608"/>
     <w:rPr>
@@ -2160,9 +2148,9 @@
       <w:color w:val="0F4761" w:themeColor="accent1" w:themeShade="BF"/>
     </w:rPr>
   </w:style>
-  <w:style w:type="character" w:styleId="IntenseReference">
+  <w:style w:type="character" w:styleId="Referenciaintensa">
     <w:name w:val="Intense Reference"/>
-    <w:basedOn w:val="DefaultParagraphFont"/>
+    <w:basedOn w:val="Fuentedeprrafopredeter"/>
     <w:uiPriority w:val="32"/>
     <w:qFormat/>
     <w:rsid w:val="007F7608"/>
@@ -2174,10 +2162,10 @@
       <w:spacing w:val="5"/>
     </w:rPr>
   </w:style>
-  <w:style w:type="paragraph" w:styleId="Header">
+  <w:style w:type="paragraph" w:styleId="Encabezado">
     <w:name w:val="header"/>
     <w:basedOn w:val="Normal"/>
-    <w:link w:val="HeaderChar"/>
+    <w:link w:val="EncabezadoCar"/>
     <w:uiPriority w:val="99"/>
     <w:unhideWhenUsed/>
     <w:rsid w:val="007F7608"/>
@@ -2189,17 +2177,17 @@
       <w:spacing w:after="0" w:line="240" w:lineRule="auto"/>
     </w:pPr>
   </w:style>
-  <w:style w:type="character" w:customStyle="1" w:styleId="HeaderChar">
-    <w:name w:val="Header Char"/>
-    <w:basedOn w:val="DefaultParagraphFont"/>
-    <w:link w:val="Header"/>
+  <w:style w:type="character" w:customStyle="1" w:styleId="EncabezadoCar">
+    <w:name w:val="Encabezado Car"/>
+    <w:basedOn w:val="Fuentedeprrafopredeter"/>
+    <w:link w:val="Encabezado"/>
     <w:uiPriority w:val="99"/>
     <w:rsid w:val="007F7608"/>
   </w:style>
-  <w:style w:type="paragraph" w:styleId="Footer">
+  <w:style w:type="paragraph" w:styleId="Piedepgina">
     <w:name w:val="footer"/>
     <w:basedOn w:val="Normal"/>
-    <w:link w:val="FooterChar"/>
+    <w:link w:val="PiedepginaCar"/>
     <w:uiPriority w:val="99"/>
     <w:unhideWhenUsed/>
     <w:rsid w:val="007F7608"/>
@@ -2211,17 +2199,17 @@
       <w:spacing w:after="0" w:line="240" w:lineRule="auto"/>
     </w:pPr>
   </w:style>
-  <w:style w:type="character" w:customStyle="1" w:styleId="FooterChar">
-    <w:name w:val="Footer Char"/>
-    <w:basedOn w:val="DefaultParagraphFont"/>
-    <w:link w:val="Footer"/>
+  <w:style w:type="character" w:customStyle="1" w:styleId="PiedepginaCar">
+    <w:name w:val="Pie de página Car"/>
+    <w:basedOn w:val="Fuentedeprrafopredeter"/>
+    <w:link w:val="Piedepgina"/>
     <w:uiPriority w:val="99"/>
     <w:rsid w:val="007F7608"/>
   </w:style>
-  <w:style w:type="paragraph" w:styleId="BodyText">
+  <w:style w:type="paragraph" w:styleId="Textoindependiente">
     <w:name w:val="Body Text"/>
     <w:basedOn w:val="Normal"/>
-    <w:link w:val="BodyTextChar"/>
+    <w:link w:val="TextoindependienteCar"/>
     <w:uiPriority w:val="1"/>
     <w:qFormat/>
     <w:rsid w:val="007F7608"/>
@@ -2238,10 +2226,10 @@
       <w14:ligatures w14:val="none"/>
     </w:rPr>
   </w:style>
-  <w:style w:type="character" w:customStyle="1" w:styleId="BodyTextChar">
-    <w:name w:val="Body Text Char"/>
-    <w:basedOn w:val="DefaultParagraphFont"/>
-    <w:link w:val="BodyText"/>
+  <w:style w:type="character" w:customStyle="1" w:styleId="TextoindependienteCar">
+    <w:name w:val="Texto independiente Car"/>
+    <w:basedOn w:val="Fuentedeprrafopredeter"/>
+    <w:link w:val="Textoindependiente"/>
     <w:uiPriority w:val="1"/>
     <w:rsid w:val="007F7608"/>
     <w:rPr>
@@ -2253,7 +2241,7 @@
   </w:style>
   <w:style w:type="paragraph" w:customStyle="1" w:styleId="Head1">
     <w:name w:val="Head 1"/>
-    <w:basedOn w:val="Heading1"/>
+    <w:basedOn w:val="Ttulo1"/>
     <w:link w:val="Head1Char"/>
     <w:qFormat/>
     <w:rsid w:val="007F7608"/>
@@ -2271,7 +2259,7 @@
   </w:style>
   <w:style w:type="character" w:customStyle="1" w:styleId="Head1Char">
     <w:name w:val="Head 1 Char"/>
-    <w:basedOn w:val="Heading1Char"/>
+    <w:basedOn w:val="Ttulo1Car"/>
     <w:link w:val="Head1"/>
     <w:rsid w:val="007F7608"/>
     <w:rPr>
@@ -2283,9 +2271,9 @@
       <w:szCs w:val="28"/>
     </w:rPr>
   </w:style>
-  <w:style w:type="character" w:styleId="Hyperlink">
+  <w:style w:type="character" w:styleId="Hipervnculo">
     <w:name w:val="Hyperlink"/>
-    <w:basedOn w:val="DefaultParagraphFont"/>
+    <w:basedOn w:val="Fuentedeprrafopredeter"/>
     <w:uiPriority w:val="99"/>
     <w:unhideWhenUsed/>
     <w:rsid w:val="00DC2162"/>
@@ -2294,9 +2282,9 @@
       <w:u w:val="single"/>
     </w:rPr>
   </w:style>
-  <w:style w:type="character" w:styleId="UnresolvedMention">
+  <w:style w:type="character" w:customStyle="1" w:styleId="UnresolvedMention">
     <w:name w:val="Unresolved Mention"/>
-    <w:basedOn w:val="DefaultParagraphFont"/>
+    <w:basedOn w:val="Fuentedeprrafopredeter"/>
     <w:uiPriority w:val="99"/>
     <w:semiHidden/>
     <w:unhideWhenUsed/>
@@ -2306,9 +2294,9 @@
       <w:shd w:val="clear" w:color="auto" w:fill="E1DFDD"/>
     </w:rPr>
   </w:style>
-  <w:style w:type="character" w:styleId="FollowedHyperlink">
+  <w:style w:type="character" w:styleId="Hipervnculovisitado">
     <w:name w:val="FollowedHyperlink"/>
-    <w:basedOn w:val="DefaultParagraphFont"/>
+    <w:basedOn w:val="Fuentedeprrafopredeter"/>
     <w:uiPriority w:val="99"/>
     <w:semiHidden/>
     <w:unhideWhenUsed/>

</xml_diff>

<commit_message>
aporte documento fase 4 conclusiones sergio bermudez
</commit_message>
<xml_diff>
--- a/Fase 4 Practicas Simuladas.docx
+++ b/Fase 4 Practicas Simuladas.docx
@@ -46,8 +46,6 @@
           <w:szCs w:val="28"/>
         </w:rPr>
       </w:pPr>
-      <w:bookmarkStart w:id="0" w:name="_GoBack"/>
-      <w:bookmarkEnd w:id="0"/>
     </w:p>
     <w:p>
       <w:pPr>
@@ -546,6 +544,8 @@
     </w:p>
     <w:p>
       <w:pPr>
+        <w:spacing w:line="480" w:lineRule="auto"/>
+        <w:ind w:firstLine="720"/>
         <w:rPr>
           <w:rFonts w:ascii="Times New Roman" w:hAnsi="Times New Roman" w:cs="Times New Roman"/>
         </w:rPr>
@@ -559,13 +559,16 @@
     </w:p>
     <w:p>
       <w:pPr>
-        <w:rPr>
-          <w:rFonts w:ascii="Times New Roman" w:hAnsi="Times New Roman" w:cs="Times New Roman"/>
-        </w:rPr>
-      </w:pPr>
-    </w:p>
-    <w:p>
-      <w:pPr>
+        <w:spacing w:line="480" w:lineRule="auto"/>
+        <w:rPr>
+          <w:rFonts w:ascii="Times New Roman" w:hAnsi="Times New Roman" w:cs="Times New Roman"/>
+        </w:rPr>
+      </w:pPr>
+    </w:p>
+    <w:p>
+      <w:pPr>
+        <w:spacing w:line="480" w:lineRule="auto"/>
+        <w:ind w:firstLine="720"/>
         <w:rPr>
           <w:rFonts w:ascii="Times New Roman" w:hAnsi="Times New Roman" w:cs="Times New Roman"/>
         </w:rPr>
@@ -587,6 +590,13 @@
           <w:rFonts w:ascii="Times New Roman" w:hAnsi="Times New Roman" w:cs="Times New Roman"/>
         </w:rPr>
         <w:br/>
+      </w:r>
+      <w:bookmarkStart w:id="0" w:name="_GoBack"/>
+      <w:bookmarkEnd w:id="0"/>
+      <w:r>
+        <w:rPr>
+          <w:rFonts w:ascii="Times New Roman" w:hAnsi="Times New Roman" w:cs="Times New Roman"/>
+        </w:rPr>
         <w:t xml:space="preserve">Al crear errores personalizados, conectarlos entre sí y usar bloques claros como try, </w:t>
       </w:r>
       <w:proofErr w:type="spellStart"/>
@@ -642,6 +652,36 @@
           <w:rFonts w:ascii="Times New Roman" w:hAnsi="Times New Roman" w:cs="Times New Roman"/>
         </w:rPr>
         <w:br/>
+      </w:r>
+    </w:p>
+    <w:p>
+      <w:pPr>
+        <w:spacing w:line="480" w:lineRule="auto"/>
+        <w:rPr>
+          <w:rFonts w:ascii="Times New Roman" w:hAnsi="Times New Roman" w:cs="Times New Roman"/>
+        </w:rPr>
+      </w:pPr>
+    </w:p>
+    <w:p>
+      <w:pPr>
+        <w:spacing w:line="480" w:lineRule="auto"/>
+        <w:rPr>
+          <w:rFonts w:ascii="Times New Roman" w:hAnsi="Times New Roman" w:cs="Times New Roman"/>
+        </w:rPr>
+      </w:pPr>
+    </w:p>
+    <w:p>
+      <w:pPr>
+        <w:spacing w:line="480" w:lineRule="auto"/>
+        <w:ind w:firstLine="720"/>
+        <w:rPr>
+          <w:rFonts w:ascii="Times New Roman" w:hAnsi="Times New Roman" w:cs="Times New Roman"/>
+        </w:rPr>
+      </w:pPr>
+      <w:r>
+        <w:rPr>
+          <w:rFonts w:ascii="Times New Roman" w:hAnsi="Times New Roman" w:cs="Times New Roman"/>
+        </w:rPr>
         <w:t>Al final, el código y el historial de cambios de este proyecto se han guardado y organizado en un repositorio de GitHub. El enlace al repositorio viene incluido en este informe para que se pueda revisar y comprobar.</w:t>
       </w:r>
     </w:p>
@@ -740,6 +780,71 @@
     </w:p>
     <w:p>
       <w:pPr>
+        <w:spacing w:line="480" w:lineRule="auto"/>
+        <w:ind w:firstLine="720"/>
+        <w:rPr>
+          <w:rFonts w:ascii="Times New Roman" w:hAnsi="Times New Roman" w:cs="Times New Roman"/>
+        </w:rPr>
+      </w:pPr>
+      <w:r>
+        <w:rPr>
+          <w:rFonts w:ascii="Times New Roman" w:hAnsi="Times New Roman" w:cs="Times New Roman"/>
+        </w:rPr>
+        <w:t>Colaboración y Control de Versiones con GitHub: El desarrollo del proyecto dentro de un repositorio en GitHub fue determinante para el éxito del trabajo grupal. Esta herramienta permitió una integración coherente del código desarrollado por cada integrante, garantizando que cada línea estuviera documentada y que el proyecto final fuera una solución funcional y organizada</w:t>
+      </w:r>
+      <w:r>
+        <w:rPr>
+          <w:rFonts w:ascii="Times New Roman" w:hAnsi="Times New Roman" w:cs="Times New Roman"/>
+        </w:rPr>
+        <w:t>.</w:t>
+      </w:r>
+    </w:p>
+    <w:p>
+      <w:pPr>
+        <w:spacing w:line="480" w:lineRule="auto"/>
+        <w:ind w:firstLine="720"/>
+        <w:rPr>
+          <w:rFonts w:ascii="Times New Roman" w:hAnsi="Times New Roman" w:cs="Times New Roman"/>
+        </w:rPr>
+      </w:pPr>
+      <w:r>
+        <w:rPr>
+          <w:rFonts w:ascii="Times New Roman" w:hAnsi="Times New Roman" w:cs="Times New Roman"/>
+        </w:rPr>
+        <w:t>Eficiencia de la Arquitectura Orientada a Objetos: El uso riguroso de principios como la abstracción, herencia y polimorfismo facilitó la creación de una aplicación modular y extensible. Esto se evidenció en la capacidad de derivar servicios especializados a partir de clases abstractas, permitiendo que cada uno gestione sus propios cálculos y parámetros de forma independiente</w:t>
+      </w:r>
+      <w:r>
+        <w:rPr>
+          <w:rFonts w:ascii="Times New Roman" w:hAnsi="Times New Roman" w:cs="Times New Roman"/>
+        </w:rPr>
+        <w:t>.</w:t>
+      </w:r>
+    </w:p>
+    <w:p>
+      <w:pPr>
+        <w:spacing w:line="480" w:lineRule="auto"/>
+        <w:ind w:firstLine="720"/>
+        <w:rPr>
+          <w:rFonts w:ascii="Times New Roman" w:hAnsi="Times New Roman" w:cs="Times New Roman"/>
+        </w:rPr>
+      </w:pPr>
+      <w:r>
+        <w:rPr>
+          <w:rFonts w:ascii="Times New Roman" w:hAnsi="Times New Roman" w:cs="Times New Roman"/>
+        </w:rPr>
+        <w:t>Validación mediante Simulación de Operaciones: La ejecución secuencial y la simulación de múltiples operaciones (tanto exitosas como fallidas) permitieron validar que la lógica de negocio y las validaciones de datos son efectivas, demostrando que un diseño orientado a objetos bien estructurado puede manejar cálculos complejos y estados de reserva de forma segura</w:t>
+      </w:r>
+      <w:r>
+        <w:rPr>
+          <w:rFonts w:ascii="Times New Roman" w:hAnsi="Times New Roman" w:cs="Times New Roman"/>
+        </w:rPr>
+        <w:t>.</w:t>
+      </w:r>
+    </w:p>
+    <w:p>
+      <w:pPr>
+        <w:spacing w:line="480" w:lineRule="auto"/>
+        <w:ind w:firstLine="720"/>
         <w:rPr>
           <w:rFonts w:ascii="Times New Roman" w:hAnsi="Times New Roman" w:cs="Times New Roman"/>
         </w:rPr>
@@ -750,6 +855,18 @@
           <w:docGrid w:linePitch="360"/>
         </w:sectPr>
       </w:pPr>
+      <w:r>
+        <w:rPr>
+          <w:rFonts w:ascii="Times New Roman" w:hAnsi="Times New Roman" w:cs="Times New Roman"/>
+        </w:rPr>
+        <w:t>Fomento de Buenas Prácticas de Codificación: La obligación de documentar cada línea de código de forma clara y precisa para el trabajo colaborativo en GitHub no solo mejoró la legibilidad del proyecto, sino que facilitó que todos los integrantes del grupo pudieran validar y corregir segmentos de código de manera secuencial</w:t>
+      </w:r>
+      <w:r>
+        <w:rPr>
+          <w:rFonts w:ascii="Times New Roman" w:hAnsi="Times New Roman" w:cs="Times New Roman"/>
+        </w:rPr>
+        <w:t>.</w:t>
+      </w:r>
     </w:p>
     <w:p>
       <w:pPr>
@@ -774,6 +891,8 @@
     </w:p>
     <w:p>
       <w:pPr>
+        <w:spacing w:line="480" w:lineRule="auto"/>
+        <w:ind w:firstLine="720"/>
         <w:rPr>
           <w:rFonts w:ascii="Times New Roman" w:hAnsi="Times New Roman" w:cs="Times New Roman"/>
         </w:rPr>
@@ -801,6 +920,7 @@
     </w:p>
     <w:p>
       <w:pPr>
+        <w:spacing w:line="480" w:lineRule="auto"/>
         <w:rPr>
           <w:rFonts w:ascii="Times New Roman" w:hAnsi="Times New Roman" w:cs="Times New Roman"/>
           <w:lang w:val="en-US"/>
@@ -848,6 +968,8 @@
     </w:p>
     <w:p>
       <w:pPr>
+        <w:spacing w:line="480" w:lineRule="auto"/>
+        <w:ind w:firstLine="720"/>
         <w:rPr>
           <w:rFonts w:ascii="Times New Roman" w:hAnsi="Times New Roman" w:cs="Times New Roman"/>
           <w:lang w:val="es-MX"/>
@@ -928,6 +1050,8 @@
     </w:p>
     <w:p>
       <w:pPr>
+        <w:spacing w:line="480" w:lineRule="auto"/>
+        <w:ind w:firstLine="720"/>
         <w:rPr>
           <w:rFonts w:ascii="Times New Roman" w:hAnsi="Times New Roman" w:cs="Times New Roman"/>
           <w:lang w:val="es-MX"/>
@@ -1022,6 +1146,8 @@
     </w:p>
     <w:p>
       <w:pPr>
+        <w:spacing w:line="480" w:lineRule="auto"/>
+        <w:ind w:firstLine="720"/>
         <w:rPr>
           <w:rFonts w:ascii="Times New Roman" w:hAnsi="Times New Roman" w:cs="Times New Roman"/>
         </w:rPr>

</xml_diff>